<commit_message>
Add PVG Scheme membership and DSEAR to all 18 Hard FM deliverables checklists
Both were completely absent across every system checklist despite being
genuine RIBA-stage gate deliverables. PVG (contractor personnel vetting for
occupied-hospital site access) was added universally to all 18, since it
applies to every system. DSEAR (dangerous substances/explosive atmospheres)
was scoped to the 6 checklists where it's substantively relevant - Boiler,
Compressed Air, Steam, Chilled Water, Electrical (generator fuel/UPS
battery), and Medical Gases - rather than force-fit into checklists with no
real dangerous-substance angle (Lift, Security, Pneumatic Tube, etc.).

Found via a cross-check against a parallel regulatory audit of the Group
Discussion project's nhs-scotland-* Hard FM compliance agents, which
surfaced the same F-Gas/DSEAR depth problem this evening.

Co-Authored-By: Claude Sonnet 5 <noreply@anthropic.com>
Claude-Session: https://claude.ai/code/session_01F6ENyq5jsYnuqv2xmyeFr3
</commit_message>
<xml_diff>
--- a/Document_Outlines/Input data - systems/Above_Ground.docx
+++ b/Document_Outlines/Input data - systems/Above_Ground.docx
@@ -3095,6 +3095,17 @@
       </w:pPr>
       <w:r>
         <w:t>Full as-fitted information to support future maintenance and modifications</w:t>
+      </w:r>
+    </w:p>
+    <w:p>
+      <w:pPr>
+        <w:numPr>
+          <w:ilvl w:val="0"/>
+          <w:numId w:val="2"/>
+        </w:numPr>
+      </w:pPr>
+      <w:r>
+        <w:t>Evidence of current PVG Scheme membership for all contractor personnel attending site</w:t>
       </w:r>
     </w:p>
     <w:p/>

</xml_diff>